<commit_message>
Documentación sin referencias al repositorio público de GitHub
Co-Authored-By: Claude Fable 5 <noreply@anthropic.com>
</commit_message>
<xml_diff>
--- a/docs/manuales/docx/Memoria.docx
+++ b/docs/manuales/docx/Memoria.docx
@@ -1581,23 +1581,7 @@
           <w:sz w:val="24"/>
           <w:szCs w:val="24"/>
         </w:rPr>
-        <w:t xml:space="preserve">La aplicación web completa, con su código fuente en el repositorio público </w:t>
-      </w:r>
-      <w:r>
-        <w:rPr>
-          <w:rFonts w:ascii="Courier New" w:cs="Courier New" w:eastAsia="Courier New" w:hAnsi="Courier New"/>
-          <w:sz w:val="22"/>
-          <w:szCs w:val="22"/>
-        </w:rPr>
-        <w:t xml:space="preserve">github.com/ShockyDEV/IUCE-WEB</w:t>
-      </w:r>
-      <w:r>
-        <w:rPr>
-          <w:rFonts w:ascii="Times New Roman" w:cs="Times New Roman" w:eastAsia="Times New Roman" w:hAnsi="Times New Roman"/>
-          <w:sz w:val="24"/>
-          <w:szCs w:val="24"/>
-        </w:rPr>
-        <w:t xml:space="preserve"> (rama </w:t>
+        <w:t xml:space="preserve">La aplicación web completa, con su código fuente bajo control de versiones (Git, rama </w:t>
       </w:r>
       <w:r>
         <w:rPr>
@@ -3637,7 +3621,7 @@
           <w:sz w:val="24"/>
           <w:szCs w:val="24"/>
         </w:rPr>
-        <w:t xml:space="preserve">IUCE Reservas — sistema de gestión de reservas de espacios del IUCE: </w:t>
+        <w:t xml:space="preserve">IUCE Reservas — sistema de gestión de reservas de espacios del IUCE (Trabajo de Fin de Grado en Ingeniería Informática, Universidad de Burgos, 2026): </w:t>
       </w:r>
       <w:r>
         <w:rPr>
@@ -3645,7 +3629,7 @@
           <w:sz w:val="22"/>
           <w:szCs w:val="22"/>
         </w:rPr>
-        <w:t xml:space="preserve">https://github.com/ShockyDEV/IUCE-Reservas-TFG</w:t>
+        <w:t xml:space="preserve">https://reservas.iuce.usal.es</w:t>
       </w:r>
     </w:p>
     <w:sectPr>

</xml_diff>